<commit_message>
Apply same popup modal, sibling creation button, back button, and fixed scroll layout to Floating Accounts (shenavar) tab
</commit_message>
<xml_diff>
--- a/Doc1.docx
+++ b/Doc1.docx
@@ -412,123 +412,1047 @@
           <w:rFonts w:hint="cs"/>
           <w:rtl/>
         </w:rPr>
-        <w:t>قابل تنظیم باشد و کاربر فقط بتواند تعداد سطوح تفضیلی را مشخص کند که تعداد سطوح تفضیلی ، یک سطح باشد و فقط شامل تفضیلی 1 بش</w:t>
-      </w:r>
+        <w:t xml:space="preserve">قابل تنظیم باشد و کاربر فقط بتواند تعداد سطوح تفضیلی را مشخص کند که تعداد سطوح تفضیلی ، یک سطح باشد و فقط شامل تفضیلی 1 </w:t>
+      </w:r>
+      <w:r>
+        <w:rPr>
+          <w:rFonts w:hint="cs"/>
+          <w:rtl/>
+        </w:rPr>
+        <w:t>(</w:t>
+      </w:r>
+      <w:r>
+        <w:rPr>
+          <w:rFonts w:hint="cs"/>
+          <w:rtl/>
+        </w:rPr>
+        <w:t>با طول کد</w:t>
+      </w:r>
+      <w:r>
+        <w:rPr>
+          <w:rFonts w:hint="cs"/>
+          <w:rtl/>
+        </w:rPr>
+        <w:t xml:space="preserve"> حداکثر 6 رقم ) </w:t>
+      </w:r>
+      <w:r>
+        <w:rPr>
+          <w:rFonts w:hint="cs"/>
+          <w:rtl/>
+        </w:rPr>
+        <w:t xml:space="preserve"> و یا </w:t>
+      </w:r>
+      <w:r>
+        <w:rPr>
+          <w:rFonts w:hint="cs"/>
+          <w:rtl/>
+        </w:rPr>
+        <w:t>تعداد سطوح تفضیلی</w:t>
+      </w:r>
+      <w:r>
+        <w:rPr>
+          <w:rFonts w:hint="cs"/>
+          <w:rtl/>
+        </w:rPr>
+        <w:t xml:space="preserve"> ، دو سطح باشد و شامل تفضیلی 1 </w:t>
+      </w:r>
+      <w:r>
+        <w:rPr>
+          <w:rFonts w:hint="cs"/>
+          <w:rtl/>
+        </w:rPr>
+        <w:t xml:space="preserve">(با طول کد حداکثر 6 رقم )  </w:t>
+      </w:r>
+      <w:r>
+        <w:rPr>
+          <w:rFonts w:hint="cs"/>
+          <w:rtl/>
+        </w:rPr>
+        <w:t xml:space="preserve">و تفضیلی 2 </w:t>
+      </w:r>
+      <w:r>
+        <w:rPr>
+          <w:rFonts w:hint="cs"/>
+          <w:rtl/>
+        </w:rPr>
+        <w:t xml:space="preserve">(با طول کد حداکثر 6 رقم )  </w:t>
+      </w:r>
+      <w:r>
+        <w:rPr>
+          <w:rFonts w:hint="cs"/>
+          <w:rtl/>
+        </w:rPr>
+        <w:t xml:space="preserve">بشود و یا </w:t>
+      </w:r>
+      <w:r>
+        <w:rPr>
+          <w:rFonts w:hint="cs"/>
+          <w:rtl/>
+        </w:rPr>
+        <w:t>تعداد سطوح تفضیلی</w:t>
+      </w:r>
+      <w:r>
+        <w:rPr>
+          <w:rFonts w:hint="cs"/>
+          <w:rtl/>
+        </w:rPr>
+        <w:t xml:space="preserve"> سه سطح باشد و شامل </w:t>
+      </w:r>
+      <w:r>
+        <w:rPr>
+          <w:rFonts w:hint="cs"/>
+          <w:rtl/>
+        </w:rPr>
+        <w:t xml:space="preserve">تفضیلی 1 </w:t>
+      </w:r>
+      <w:r>
+        <w:rPr>
+          <w:rFonts w:hint="cs"/>
+          <w:rtl/>
+        </w:rPr>
+        <w:t xml:space="preserve">(با طول کد حداکثر 6 رقم )  </w:t>
+      </w:r>
+      <w:r>
+        <w:rPr>
+          <w:rFonts w:hint="cs"/>
+          <w:rtl/>
+        </w:rPr>
+        <w:t>و تفضیلی 2</w:t>
+      </w:r>
+      <w:r>
+        <w:rPr>
+          <w:rFonts w:hint="cs"/>
+          <w:rtl/>
+        </w:rPr>
+        <w:t xml:space="preserve"> </w:t>
+      </w:r>
+      <w:r>
+        <w:rPr>
+          <w:rFonts w:hint="cs"/>
+          <w:rtl/>
+        </w:rPr>
+        <w:t xml:space="preserve">(با طول کد حداکثر 6 رقم )  </w:t>
+      </w:r>
+      <w:r>
+        <w:rPr>
+          <w:rFonts w:hint="cs"/>
+          <w:rtl/>
+        </w:rPr>
+        <w:t xml:space="preserve">و تفضیلی 3 </w:t>
+      </w:r>
+      <w:r>
+        <w:rPr>
+          <w:rFonts w:hint="cs"/>
+          <w:rtl/>
+        </w:rPr>
+        <w:t xml:space="preserve">(با طول کد حداکثر 6 رقم )  </w:t>
+      </w:r>
+      <w:r>
+        <w:rPr>
+          <w:rFonts w:hint="cs"/>
+          <w:rtl/>
+        </w:rPr>
+        <w:t xml:space="preserve">بشود </w:t>
+      </w:r>
+      <w:r>
+        <w:rPr>
+          <w:rFonts w:hint="cs"/>
+          <w:rtl/>
+        </w:rPr>
+        <w:t>و کامبوباکس نوع سرفصل های مورد استفاده رو هم دیگر بردار ، و همه شرکتها از سرفصل های پیش فرض که تحت شرایطی قابل ویرایش هم خواهند بود ، استفاده خواهند کرد و فیلدهای کد اقتصادی و شناسه ملی رو هم از اینجا بردار ، چون در بخش تعریف شرکتها همین فیلدها رو داریم</w:t>
+      </w:r>
+    </w:p>
+    <w:p>
+      <w:pPr>
+        <w:tabs>
+          <w:tab w:val="left" w:pos="3646"/>
+        </w:tabs>
+        <w:bidi/>
+        <w:rPr>
+          <w:rtl/>
+        </w:rPr>
+      </w:pPr>
+      <w:r>
+        <w:rPr>
+          <w:rFonts w:hint="cs"/>
+          <w:rtl/>
+        </w:rPr>
+        <w:t>99999999999999999999999999999</w:t>
+      </w:r>
+      <w:r>
+        <w:rPr>
+          <w:rtl/>
+        </w:rPr>
+        <w:tab/>
+      </w:r>
+    </w:p>
+    <w:p>
+      <w:pPr>
+        <w:tabs>
+          <w:tab w:val="left" w:pos="3646"/>
+        </w:tabs>
+        <w:bidi/>
+        <w:rPr>
+          <w:rFonts w:hint="cs"/>
+          <w:rtl/>
+        </w:rPr>
+      </w:pPr>
+      <w:r>
+        <w:rPr>
+          <w:rFonts w:hint="cs"/>
+          <w:rtl/>
+        </w:rPr>
+        <w:t>در این صفحه تصویر اول</w:t>
+      </w:r>
+    </w:p>
+    <w:p>
+      <w:pPr>
+        <w:tabs>
+          <w:tab w:val="left" w:pos="3646"/>
+        </w:tabs>
+        <w:bidi/>
+        <w:rPr>
+          <w:rtl/>
+        </w:rPr>
+      </w:pPr>
+      <w:r>
+        <w:rPr>
+          <w:noProof/>
+        </w:rPr>
+        <w:lastRenderedPageBreak/>
+        <w:drawing>
+          <wp:inline distT="0" distB="0" distL="0" distR="0" wp14:anchorId="4E794F7D" wp14:editId="24139AEC">
+            <wp:extent cx="5943600" cy="3341370"/>
+            <wp:effectExtent l="0" t="0" r="0" b="0"/>
+            <wp:docPr id="3" name="Picture 3"/>
+            <wp:cNvGraphicFramePr>
+              <a:graphicFrameLocks xmlns:a="http://schemas.openxmlformats.org/drawingml/2006/main" noChangeAspect="1"/>
+            </wp:cNvGraphicFramePr>
+            <a:graphic xmlns:a="http://schemas.openxmlformats.org/drawingml/2006/main">
+              <a:graphicData uri="http://schemas.openxmlformats.org/drawingml/2006/picture">
+                <pic:pic xmlns:pic="http://schemas.openxmlformats.org/drawingml/2006/picture">
+                  <pic:nvPicPr>
+                    <pic:cNvPr id="1" name=""/>
+                    <pic:cNvPicPr/>
+                  </pic:nvPicPr>
+                  <pic:blipFill>
+                    <a:blip r:embed="rId8"/>
+                    <a:stretch>
+                      <a:fillRect/>
+                    </a:stretch>
+                  </pic:blipFill>
+                  <pic:spPr>
+                    <a:xfrm>
+                      <a:off x="0" y="0"/>
+                      <a:ext cx="5943600" cy="3341370"/>
+                    </a:xfrm>
+                    <a:prstGeom prst="rect">
+                      <a:avLst/>
+                    </a:prstGeom>
+                  </pic:spPr>
+                </pic:pic>
+              </a:graphicData>
+            </a:graphic>
+          </wp:inline>
+        </w:drawing>
+      </w:r>
+    </w:p>
+    <w:p>
+      <w:pPr>
+        <w:tabs>
+          <w:tab w:val="left" w:pos="3646"/>
+        </w:tabs>
+        <w:bidi/>
+        <w:rPr>
+          <w:rtl/>
+        </w:rPr>
+      </w:pPr>
+      <w:r>
+        <w:rPr>
+          <w:rFonts w:hint="cs"/>
+          <w:rtl/>
+        </w:rPr>
+        <w:t>می خوام که اگر</w:t>
+      </w:r>
+      <w:r>
+        <w:rPr>
+          <w:rFonts w:hint="cs"/>
+          <w:rtl/>
+        </w:rPr>
+        <w:t xml:space="preserve"> در یک سطح سرفصل حسابها ، تعداد ارقام</w:t>
+      </w:r>
+      <w:r>
+        <w:rPr>
+          <w:rFonts w:hint="cs"/>
+          <w:rtl/>
+        </w:rPr>
+        <w:t xml:space="preserve"> کد وارد شده </w:t>
+      </w:r>
+      <w:r>
+        <w:rPr>
+          <w:rFonts w:hint="cs"/>
+          <w:rtl/>
+        </w:rPr>
+        <w:t>برای یک سطح ، کمتر از تعداد ارقام مشخص شده در طول کد برای این سطح بود ، سمت چپ ارقام وارد شده توسط کاربر با تعداد مناسبی از کاراکتر "0" پر بشه تا تعداد ارقام کد به تعداد تنظیم شده در قسمت طول کد برسه</w:t>
+      </w:r>
+    </w:p>
+    <w:p>
+      <w:pPr>
+        <w:tabs>
+          <w:tab w:val="left" w:pos="3646"/>
+        </w:tabs>
+        <w:bidi/>
+        <w:rPr>
+          <w:rtl/>
+        </w:rPr>
+      </w:pPr>
+      <w:r>
+        <w:rPr>
+          <w:rFonts w:hint="cs"/>
+          <w:rtl/>
+        </w:rPr>
+        <w:t>999999999999999999999999999</w:t>
+      </w:r>
+    </w:p>
+    <w:p>
+      <w:pPr>
+        <w:tabs>
+          <w:tab w:val="left" w:pos="3646"/>
+        </w:tabs>
+        <w:bidi/>
+        <w:rPr>
+          <w:rFonts w:hint="cs"/>
+          <w:rtl/>
+        </w:rPr>
+      </w:pPr>
+      <w:r>
+        <w:rPr>
+          <w:rFonts w:hint="cs"/>
+          <w:rtl/>
+        </w:rPr>
+        <w:t>الان من در سطح تفضیلی 1 ، یک سرفصل با کد "000001" ذخیره کرده ام و بعد بعنوان سطح فرزند برای این سرفصل در سطح تفضیلی 2 اقدام به ایجاد یک سرفصل جدید کرده ام و کد آن را هم "000001" گذارده ام ، ولی برنامه تحت وب نگار این پیام خطا را ، تصویر اول</w:t>
+      </w:r>
+    </w:p>
+    <w:p>
+      <w:pPr>
+        <w:tabs>
+          <w:tab w:val="left" w:pos="3646"/>
+        </w:tabs>
+        <w:bidi/>
+        <w:rPr>
+          <w:rtl/>
+        </w:rPr>
+      </w:pPr>
+      <w:r>
+        <w:rPr>
+          <w:noProof/>
+        </w:rPr>
+        <w:lastRenderedPageBreak/>
+        <w:drawing>
+          <wp:inline distT="0" distB="0" distL="0" distR="0" wp14:anchorId="5ED074B3" wp14:editId="5D655787">
+            <wp:extent cx="5943600" cy="3341370"/>
+            <wp:effectExtent l="0" t="0" r="0" b="0"/>
+            <wp:docPr id="5" name="Picture 5"/>
+            <wp:cNvGraphicFramePr>
+              <a:graphicFrameLocks xmlns:a="http://schemas.openxmlformats.org/drawingml/2006/main" noChangeAspect="1"/>
+            </wp:cNvGraphicFramePr>
+            <a:graphic xmlns:a="http://schemas.openxmlformats.org/drawingml/2006/main">
+              <a:graphicData uri="http://schemas.openxmlformats.org/drawingml/2006/picture">
+                <pic:pic xmlns:pic="http://schemas.openxmlformats.org/drawingml/2006/picture">
+                  <pic:nvPicPr>
+                    <pic:cNvPr id="1" name=""/>
+                    <pic:cNvPicPr/>
+                  </pic:nvPicPr>
+                  <pic:blipFill>
+                    <a:blip r:embed="rId9"/>
+                    <a:stretch>
+                      <a:fillRect/>
+                    </a:stretch>
+                  </pic:blipFill>
+                  <pic:spPr>
+                    <a:xfrm>
+                      <a:off x="0" y="0"/>
+                      <a:ext cx="5943600" cy="3341370"/>
+                    </a:xfrm>
+                    <a:prstGeom prst="rect">
+                      <a:avLst/>
+                    </a:prstGeom>
+                  </pic:spPr>
+                </pic:pic>
+              </a:graphicData>
+            </a:graphic>
+          </wp:inline>
+        </w:drawing>
+      </w:r>
+    </w:p>
+    <w:p>
+      <w:pPr>
+        <w:tabs>
+          <w:tab w:val="left" w:pos="3646"/>
+        </w:tabs>
+        <w:bidi/>
+        <w:rPr>
+          <w:rtl/>
+        </w:rPr>
+      </w:pPr>
+      <w:r>
+        <w:rPr>
+          <w:rFonts w:hint="cs"/>
+          <w:rtl/>
+        </w:rPr>
+        <w:t>داده است ، من می خوام که برنامه تحت وب نگار کنترل کنه که در یک سطح کد تکراری وجود نداشته باشه ولی وجود کد تکراری در سطوح مختلف اشکالی نداشته باشد و خطا نگیره</w:t>
+      </w:r>
+    </w:p>
+    <w:p>
+      <w:pPr>
+        <w:tabs>
+          <w:tab w:val="left" w:pos="3646"/>
+        </w:tabs>
+        <w:bidi/>
+        <w:rPr>
+          <w:rtl/>
+        </w:rPr>
+      </w:pPr>
+      <w:r>
+        <w:rPr>
+          <w:rFonts w:hint="cs"/>
+          <w:rtl/>
+        </w:rPr>
+        <w:t>999999999999999999999999999</w:t>
+      </w:r>
+    </w:p>
+    <w:p>
+      <w:pPr>
+        <w:tabs>
+          <w:tab w:val="left" w:pos="3646"/>
+        </w:tabs>
+        <w:bidi/>
+        <w:rPr>
+          <w:rtl/>
+        </w:rPr>
+      </w:pPr>
+      <w:r>
+        <w:rPr>
+          <w:rtl/>
+        </w:rPr>
+        <w:t>در این صفحه تصویر اول</w:t>
+      </w:r>
+    </w:p>
+    <w:p>
+      <w:pPr>
+        <w:tabs>
+          <w:tab w:val="left" w:pos="3646"/>
+        </w:tabs>
+        <w:bidi/>
+        <w:rPr>
+          <w:rtl/>
+        </w:rPr>
+      </w:pPr>
+      <w:r>
+        <w:rPr>
+          <w:noProof/>
+        </w:rPr>
+        <w:drawing>
+          <wp:inline distT="0" distB="0" distL="0" distR="0" wp14:anchorId="0E98D5F5" wp14:editId="2ABAA2EF">
+            <wp:extent cx="5943600" cy="3341370"/>
+            <wp:effectExtent l="0" t="0" r="0" b="0"/>
+            <wp:docPr id="6" name="Picture 6"/>
+            <wp:cNvGraphicFramePr>
+              <a:graphicFrameLocks xmlns:a="http://schemas.openxmlformats.org/drawingml/2006/main" noChangeAspect="1"/>
+            </wp:cNvGraphicFramePr>
+            <a:graphic xmlns:a="http://schemas.openxmlformats.org/drawingml/2006/main">
+              <a:graphicData uri="http://schemas.openxmlformats.org/drawingml/2006/picture">
+                <pic:pic xmlns:pic="http://schemas.openxmlformats.org/drawingml/2006/picture">
+                  <pic:nvPicPr>
+                    <pic:cNvPr id="1" name=""/>
+                    <pic:cNvPicPr/>
+                  </pic:nvPicPr>
+                  <pic:blipFill>
+                    <a:blip r:embed="rId10"/>
+                    <a:stretch>
+                      <a:fillRect/>
+                    </a:stretch>
+                  </pic:blipFill>
+                  <pic:spPr>
+                    <a:xfrm>
+                      <a:off x="0" y="0"/>
+                      <a:ext cx="5943600" cy="3341370"/>
+                    </a:xfrm>
+                    <a:prstGeom prst="rect">
+                      <a:avLst/>
+                    </a:prstGeom>
+                  </pic:spPr>
+                </pic:pic>
+              </a:graphicData>
+            </a:graphic>
+          </wp:inline>
+        </w:drawing>
+      </w:r>
+    </w:p>
+    <w:p>
+      <w:pPr>
+        <w:tabs>
+          <w:tab w:val="left" w:pos="3646"/>
+        </w:tabs>
+        <w:bidi/>
+        <w:rPr>
+          <w:rtl/>
+        </w:rPr>
+      </w:pPr>
+      <w:r>
+        <w:rPr>
+          <w:rFonts w:hint="cs"/>
+          <w:rtl/>
+        </w:rPr>
+        <w:lastRenderedPageBreak/>
+        <w:t>می خوام که بعد از ذخیره موفقیت آمیز سرفصل حساب ، کرسر به همون سطحی که رکورد برای اون ایجاد شده بره و همون رکورد جدیدی که ایجاد شده رو نشون بده</w:t>
+      </w:r>
+    </w:p>
+    <w:p>
+      <w:pPr>
+        <w:tabs>
+          <w:tab w:val="left" w:pos="3646"/>
+        </w:tabs>
+        <w:bidi/>
+        <w:rPr>
+          <w:rFonts w:hint="cs"/>
+          <w:rtl/>
+        </w:rPr>
+      </w:pPr>
+      <w:r>
+        <w:rPr>
+          <w:rFonts w:hint="cs"/>
+          <w:rtl/>
+        </w:rPr>
+        <w:t>999999999999999999999999999</w:t>
+      </w:r>
+    </w:p>
+    <w:p>
+      <w:pPr>
+        <w:tabs>
+          <w:tab w:val="left" w:pos="3646"/>
+        </w:tabs>
+        <w:bidi/>
+        <w:rPr>
+          <w:rFonts w:hint="cs"/>
+          <w:rtl/>
+        </w:rPr>
+      </w:pPr>
+      <w:r>
+        <w:rPr>
+          <w:rFonts w:hint="cs"/>
+          <w:rtl/>
+        </w:rPr>
+        <w:t>در این صفحه تصویر اول</w:t>
+      </w:r>
+    </w:p>
+    <w:p>
+      <w:pPr>
+        <w:tabs>
+          <w:tab w:val="left" w:pos="3646"/>
+        </w:tabs>
+        <w:bidi/>
+        <w:rPr>
+          <w:rtl/>
+        </w:rPr>
+      </w:pPr>
+      <w:r>
+        <w:rPr>
+          <w:noProof/>
+        </w:rPr>
+        <w:drawing>
+          <wp:inline distT="0" distB="0" distL="0" distR="0" wp14:anchorId="297A70B9" wp14:editId="56180D4B">
+            <wp:extent cx="5943600" cy="3341370"/>
+            <wp:effectExtent l="0" t="0" r="0" b="0"/>
+            <wp:docPr id="7" name="Picture 7"/>
+            <wp:cNvGraphicFramePr>
+              <a:graphicFrameLocks xmlns:a="http://schemas.openxmlformats.org/drawingml/2006/main" noChangeAspect="1"/>
+            </wp:cNvGraphicFramePr>
+            <a:graphic xmlns:a="http://schemas.openxmlformats.org/drawingml/2006/main">
+              <a:graphicData uri="http://schemas.openxmlformats.org/drawingml/2006/picture">
+                <pic:pic xmlns:pic="http://schemas.openxmlformats.org/drawingml/2006/picture">
+                  <pic:nvPicPr>
+                    <pic:cNvPr id="1" name=""/>
+                    <pic:cNvPicPr/>
+                  </pic:nvPicPr>
+                  <pic:blipFill>
+                    <a:blip r:embed="rId11"/>
+                    <a:stretch>
+                      <a:fillRect/>
+                    </a:stretch>
+                  </pic:blipFill>
+                  <pic:spPr>
+                    <a:xfrm>
+                      <a:off x="0" y="0"/>
+                      <a:ext cx="5943600" cy="3341370"/>
+                    </a:xfrm>
+                    <a:prstGeom prst="rect">
+                      <a:avLst/>
+                    </a:prstGeom>
+                  </pic:spPr>
+                </pic:pic>
+              </a:graphicData>
+            </a:graphic>
+          </wp:inline>
+        </w:drawing>
+      </w:r>
+    </w:p>
+    <w:p>
+      <w:pPr>
+        <w:tabs>
+          <w:tab w:val="left" w:pos="3646"/>
+        </w:tabs>
+        <w:bidi/>
+        <w:rPr>
+          <w:rtl/>
+        </w:rPr>
+      </w:pPr>
+      <w:r>
+        <w:rPr>
+          <w:rFonts w:hint="cs"/>
+          <w:rtl/>
+        </w:rPr>
+        <w:t>می خوام که قبل از ستون دکمه ویرایش ، یک ستون دکمه با متن دکمه "جدید" اضافه کنی و می خوام که با کلیک روی این دکمه در همون سطح یک کد جدید ایجاد کنم مثلا اگر سطح تفضیلی 1 هست ، در همون سطح تفضیلی 1 قسمت ایجاد کد جدید فعال بشه</w:t>
+      </w:r>
+    </w:p>
+    <w:p>
+      <w:pPr>
+        <w:tabs>
+          <w:tab w:val="left" w:pos="3646"/>
+        </w:tabs>
+        <w:bidi/>
+        <w:rPr>
+          <w:rFonts w:hint="cs"/>
+          <w:rtl/>
+        </w:rPr>
+      </w:pPr>
+      <w:r>
+        <w:rPr>
+          <w:rFonts w:hint="cs"/>
+          <w:rtl/>
+        </w:rPr>
+        <w:t>9999999999999999999999</w:t>
+      </w:r>
+    </w:p>
+    <w:p>
+      <w:pPr>
+        <w:tabs>
+          <w:tab w:val="left" w:pos="3646"/>
+        </w:tabs>
+        <w:bidi/>
+        <w:rPr>
+          <w:rFonts w:hint="cs"/>
+          <w:rtl/>
+        </w:rPr>
+      </w:pPr>
+      <w:r>
+        <w:rPr>
+          <w:rFonts w:hint="cs"/>
+          <w:rtl/>
+        </w:rPr>
+        <w:t>در این صفحه تصویر اول</w:t>
+      </w:r>
+    </w:p>
+    <w:p>
+      <w:pPr>
+        <w:tabs>
+          <w:tab w:val="left" w:pos="3646"/>
+        </w:tabs>
+        <w:bidi/>
+        <w:rPr>
+          <w:rtl/>
+        </w:rPr>
+      </w:pPr>
+      <w:r>
+        <w:rPr>
+          <w:noProof/>
+        </w:rPr>
+        <w:lastRenderedPageBreak/>
+        <w:drawing>
+          <wp:inline distT="0" distB="0" distL="0" distR="0" wp14:anchorId="2B798909" wp14:editId="5DB2E1D0">
+            <wp:extent cx="5943600" cy="3341370"/>
+            <wp:effectExtent l="0" t="0" r="0" b="0"/>
+            <wp:docPr id="8" name="Picture 8"/>
+            <wp:cNvGraphicFramePr>
+              <a:graphicFrameLocks xmlns:a="http://schemas.openxmlformats.org/drawingml/2006/main" noChangeAspect="1"/>
+            </wp:cNvGraphicFramePr>
+            <a:graphic xmlns:a="http://schemas.openxmlformats.org/drawingml/2006/main">
+              <a:graphicData uri="http://schemas.openxmlformats.org/drawingml/2006/picture">
+                <pic:pic xmlns:pic="http://schemas.openxmlformats.org/drawingml/2006/picture">
+                  <pic:nvPicPr>
+                    <pic:cNvPr id="1" name=""/>
+                    <pic:cNvPicPr/>
+                  </pic:nvPicPr>
+                  <pic:blipFill>
+                    <a:blip r:embed="rId12"/>
+                    <a:stretch>
+                      <a:fillRect/>
+                    </a:stretch>
+                  </pic:blipFill>
+                  <pic:spPr>
+                    <a:xfrm>
+                      <a:off x="0" y="0"/>
+                      <a:ext cx="5943600" cy="3341370"/>
+                    </a:xfrm>
+                    <a:prstGeom prst="rect">
+                      <a:avLst/>
+                    </a:prstGeom>
+                  </pic:spPr>
+                </pic:pic>
+              </a:graphicData>
+            </a:graphic>
+          </wp:inline>
+        </w:drawing>
+      </w:r>
+    </w:p>
+    <w:p>
+      <w:pPr>
+        <w:tabs>
+          <w:tab w:val="left" w:pos="3646"/>
+        </w:tabs>
+        <w:bidi/>
+        <w:rPr>
+          <w:rtl/>
+        </w:rPr>
+      </w:pPr>
+      <w:r>
+        <w:rPr>
+          <w:rFonts w:hint="cs"/>
+          <w:rtl/>
+        </w:rPr>
+        <w:t xml:space="preserve">می خوام که پنل دکمه بازگشت به منوی اصلی حذف بشه و بعد دکمه بازگشت به منوی اصلی در پنل </w:t>
+      </w:r>
+    </w:p>
+    <w:p>
+      <w:pPr>
+        <w:tabs>
+          <w:tab w:val="left" w:pos="3646"/>
+        </w:tabs>
+        <w:bidi/>
+        <w:rPr>
+          <w:rtl/>
+        </w:rPr>
+      </w:pPr>
+      <w:r>
+        <w:rPr>
+          <w:rFonts w:hint="cs"/>
+          <w:rtl/>
+        </w:rPr>
+        <w:t>نمایش سرفصل ها تا سطح :</w:t>
+      </w:r>
+    </w:p>
+    <w:p>
+      <w:pPr>
+        <w:tabs>
+          <w:tab w:val="left" w:pos="3646"/>
+        </w:tabs>
+        <w:bidi/>
+        <w:rPr>
+          <w:rtl/>
+        </w:rPr>
+      </w:pPr>
+      <w:r>
+        <w:rPr>
+          <w:rFonts w:hint="cs"/>
+          <w:rtl/>
+        </w:rPr>
+        <w:t>بعد از دکمه "+ حساب جدید" قرار داده بشه و بعد می خوام که بعد از کلیک روی دکمه "+ حساب جدید" و یا دکمه "+ جدید" و یا دکمه "ویرایش" ، به جای اونکه قسمت ایجاد و یا ویرایش حساب در پایین دیتاگرید ، تصویر دوم</w:t>
+      </w:r>
+    </w:p>
+    <w:p>
+      <w:pPr>
+        <w:tabs>
+          <w:tab w:val="left" w:pos="3646"/>
+        </w:tabs>
+        <w:bidi/>
+        <w:rPr>
+          <w:rtl/>
+        </w:rPr>
+      </w:pPr>
+      <w:r>
+        <w:rPr>
+          <w:noProof/>
+        </w:rPr>
+        <w:drawing>
+          <wp:inline distT="0" distB="0" distL="0" distR="0" wp14:anchorId="24D89727" wp14:editId="1DF0126D">
+            <wp:extent cx="5943600" cy="3341370"/>
+            <wp:effectExtent l="0" t="0" r="0" b="0"/>
+            <wp:docPr id="9" name="Picture 9"/>
+            <wp:cNvGraphicFramePr>
+              <a:graphicFrameLocks xmlns:a="http://schemas.openxmlformats.org/drawingml/2006/main" noChangeAspect="1"/>
+            </wp:cNvGraphicFramePr>
+            <a:graphic xmlns:a="http://schemas.openxmlformats.org/drawingml/2006/main">
+              <a:graphicData uri="http://schemas.openxmlformats.org/drawingml/2006/picture">
+                <pic:pic xmlns:pic="http://schemas.openxmlformats.org/drawingml/2006/picture">
+                  <pic:nvPicPr>
+                    <pic:cNvPr id="1" name=""/>
+                    <pic:cNvPicPr/>
+                  </pic:nvPicPr>
+                  <pic:blipFill>
+                    <a:blip r:embed="rId13"/>
+                    <a:stretch>
+                      <a:fillRect/>
+                    </a:stretch>
+                  </pic:blipFill>
+                  <pic:spPr>
+                    <a:xfrm>
+                      <a:off x="0" y="0"/>
+                      <a:ext cx="5943600" cy="3341370"/>
+                    </a:xfrm>
+                    <a:prstGeom prst="rect">
+                      <a:avLst/>
+                    </a:prstGeom>
+                  </pic:spPr>
+                </pic:pic>
+              </a:graphicData>
+            </a:graphic>
+          </wp:inline>
+        </w:drawing>
+      </w:r>
+    </w:p>
+    <w:p>
+      <w:pPr>
+        <w:tabs>
+          <w:tab w:val="left" w:pos="3646"/>
+          <w:tab w:val="left" w:pos="6180"/>
+        </w:tabs>
+        <w:bidi/>
+        <w:rPr>
+          <w:rtl/>
+        </w:rPr>
+      </w:pPr>
+      <w:r>
+        <w:rPr>
+          <w:rFonts w:hint="cs"/>
+          <w:rtl/>
+        </w:rPr>
+        <w:t xml:space="preserve">نمایش داده بشه ، این قسمت در یک پنجره پاپ آپ شکیل و زیبا نمایش داده بشه </w:t>
+      </w:r>
+      <w:r>
+        <w:rPr>
+          <w:rtl/>
+        </w:rPr>
+        <w:tab/>
+      </w:r>
+    </w:p>
+    <w:p>
+      <w:pPr>
+        <w:tabs>
+          <w:tab w:val="left" w:pos="3646"/>
+          <w:tab w:val="left" w:pos="6180"/>
+        </w:tabs>
+        <w:bidi/>
+        <w:rPr>
+          <w:rFonts w:hint="cs"/>
+          <w:rtl/>
+        </w:rPr>
+      </w:pPr>
+      <w:r>
+        <w:rPr>
+          <w:rFonts w:hint="cs"/>
+          <w:rtl/>
+        </w:rPr>
+        <w:lastRenderedPageBreak/>
+        <w:t>99999999999999999999999999</w:t>
+      </w:r>
+    </w:p>
+    <w:p>
+      <w:pPr>
+        <w:tabs>
+          <w:tab w:val="left" w:pos="3646"/>
+          <w:tab w:val="left" w:pos="6180"/>
+        </w:tabs>
+        <w:bidi/>
+        <w:rPr>
+          <w:rFonts w:hint="cs"/>
+          <w:rtl/>
+        </w:rPr>
+      </w:pPr>
+      <w:r>
+        <w:rPr>
+          <w:rFonts w:hint="cs"/>
+          <w:rtl/>
+        </w:rPr>
+        <w:t>در این صفحه تصویر اول</w:t>
+      </w:r>
+    </w:p>
+    <w:p>
+      <w:pPr>
+        <w:tabs>
+          <w:tab w:val="left" w:pos="3646"/>
+          <w:tab w:val="left" w:pos="6180"/>
+        </w:tabs>
+        <w:bidi/>
+        <w:rPr>
+          <w:rtl/>
+        </w:rPr>
+      </w:pPr>
+      <w:r>
+        <w:rPr>
+          <w:noProof/>
+        </w:rPr>
+        <w:drawing>
+          <wp:inline distT="0" distB="0" distL="0" distR="0" wp14:anchorId="4539EC4A" wp14:editId="1FE7C04D">
+            <wp:extent cx="5943600" cy="3341370"/>
+            <wp:effectExtent l="0" t="0" r="0" b="0"/>
+            <wp:docPr id="10" name="Picture 10"/>
+            <wp:cNvGraphicFramePr>
+              <a:graphicFrameLocks xmlns:a="http://schemas.openxmlformats.org/drawingml/2006/main" noChangeAspect="1"/>
+            </wp:cNvGraphicFramePr>
+            <a:graphic xmlns:a="http://schemas.openxmlformats.org/drawingml/2006/main">
+              <a:graphicData uri="http://schemas.openxmlformats.org/drawingml/2006/picture">
+                <pic:pic xmlns:pic="http://schemas.openxmlformats.org/drawingml/2006/picture">
+                  <pic:nvPicPr>
+                    <pic:cNvPr id="1" name=""/>
+                    <pic:cNvPicPr/>
+                  </pic:nvPicPr>
+                  <pic:blipFill>
+                    <a:blip r:embed="rId14"/>
+                    <a:stretch>
+                      <a:fillRect/>
+                    </a:stretch>
+                  </pic:blipFill>
+                  <pic:spPr>
+                    <a:xfrm>
+                      <a:off x="0" y="0"/>
+                      <a:ext cx="5943600" cy="3341370"/>
+                    </a:xfrm>
+                    <a:prstGeom prst="rect">
+                      <a:avLst/>
+                    </a:prstGeom>
+                  </pic:spPr>
+                </pic:pic>
+              </a:graphicData>
+            </a:graphic>
+          </wp:inline>
+        </w:drawing>
+      </w:r>
+    </w:p>
+    <w:p>
+      <w:pPr>
+        <w:tabs>
+          <w:tab w:val="left" w:pos="3646"/>
+          <w:tab w:val="left" w:pos="6180"/>
+        </w:tabs>
+        <w:bidi/>
+        <w:rPr>
+          <w:rtl/>
+        </w:rPr>
+      </w:pPr>
+      <w:r>
+        <w:rPr>
+          <w:rFonts w:hint="cs"/>
+          <w:rtl/>
+        </w:rPr>
+        <w:t>می خوام که اسکرول عمودی کل صفحه نمایش داده نشه و می خوام که صفحه تا بعد از عنوان سر ستونهای دیتاگرید ثابت بمونه و فقط اسکرول عمودی در دیتاگرید فعال بشه ، اون هم می خوام که عنوان سرستونها ثابت باشن و فقط اسکرول عمودی برای رکوردها و سطرهای دیتاگرید انجام بشه</w:t>
+      </w:r>
+    </w:p>
+    <w:p>
+      <w:pPr>
+        <w:tabs>
+          <w:tab w:val="left" w:pos="3646"/>
+          <w:tab w:val="left" w:pos="6180"/>
+        </w:tabs>
+        <w:bidi/>
+        <w:rPr>
+          <w:rFonts w:hint="cs"/>
+          <w:rtl/>
+        </w:rPr>
+      </w:pPr>
+      <w:r>
+        <w:rPr>
+          <w:rFonts w:hint="cs"/>
+          <w:rtl/>
+        </w:rPr>
+        <w:t>99999999999999999999999999</w:t>
+      </w:r>
+    </w:p>
+    <w:p>
+      <w:pPr>
+        <w:tabs>
+          <w:tab w:val="left" w:pos="3646"/>
+          <w:tab w:val="left" w:pos="6180"/>
+        </w:tabs>
+        <w:bidi/>
+        <w:rPr>
+          <w:rFonts w:hint="cs"/>
+          <w:rtl/>
+        </w:rPr>
+      </w:pPr>
+      <w:r>
+        <w:rPr>
+          <w:rFonts w:hint="cs"/>
+          <w:rtl/>
+        </w:rPr>
+        <w:t>نوار وضعیت پیشرفت کار</w:t>
+      </w:r>
+    </w:p>
+    <w:p>
+      <w:pPr>
+        <w:tabs>
+          <w:tab w:val="left" w:pos="3646"/>
+          <w:tab w:val="left" w:pos="6180"/>
+        </w:tabs>
+        <w:bidi/>
+        <w:rPr>
+          <w:rtl/>
+        </w:rPr>
+      </w:pPr>
+      <w:r>
+        <w:rPr>
+          <w:noProof/>
+        </w:rPr>
+        <w:lastRenderedPageBreak/>
+        <w:drawing>
+          <wp:inline distT="0" distB="0" distL="0" distR="0" wp14:anchorId="651DDCDC" wp14:editId="5B5B7519">
+            <wp:extent cx="5943600" cy="3341370"/>
+            <wp:effectExtent l="0" t="0" r="0" b="0"/>
+            <wp:docPr id="11" name="Picture 11"/>
+            <wp:cNvGraphicFramePr>
+              <a:graphicFrameLocks xmlns:a="http://schemas.openxmlformats.org/drawingml/2006/main" noChangeAspect="1"/>
+            </wp:cNvGraphicFramePr>
+            <a:graphic xmlns:a="http://schemas.openxmlformats.org/drawingml/2006/main">
+              <a:graphicData uri="http://schemas.openxmlformats.org/drawingml/2006/picture">
+                <pic:pic xmlns:pic="http://schemas.openxmlformats.org/drawingml/2006/picture">
+                  <pic:nvPicPr>
+                    <pic:cNvPr id="1" name=""/>
+                    <pic:cNvPicPr/>
+                  </pic:nvPicPr>
+                  <pic:blipFill>
+                    <a:blip r:embed="rId15"/>
+                    <a:stretch>
+                      <a:fillRect/>
+                    </a:stretch>
+                  </pic:blipFill>
+                  <pic:spPr>
+                    <a:xfrm>
+                      <a:off x="0" y="0"/>
+                      <a:ext cx="5943600" cy="3341370"/>
+                    </a:xfrm>
+                    <a:prstGeom prst="rect">
+                      <a:avLst/>
+                    </a:prstGeom>
+                  </pic:spPr>
+                </pic:pic>
+              </a:graphicData>
+            </a:graphic>
+          </wp:inline>
+        </w:drawing>
+      </w:r>
+    </w:p>
+    <w:p>
+      <w:pPr>
+        <w:tabs>
+          <w:tab w:val="left" w:pos="3646"/>
+          <w:tab w:val="left" w:pos="6180"/>
+        </w:tabs>
+        <w:bidi/>
+        <w:rPr>
+          <w:rtl/>
+        </w:rPr>
+      </w:pPr>
       <w:bookmarkStart w:id="0" w:name="_GoBack"/>
       <w:bookmarkEnd w:id="0"/>
-      <w:r>
-        <w:rPr>
-          <w:rFonts w:hint="cs"/>
-          <w:rtl/>
-        </w:rPr>
-        <w:t xml:space="preserve">ود و یا </w:t>
-      </w:r>
-      <w:r>
-        <w:rPr>
-          <w:rFonts w:hint="cs"/>
-          <w:rtl/>
-        </w:rPr>
-        <w:t>تعداد سطوح تفضیلی</w:t>
-      </w:r>
-      <w:r>
-        <w:rPr>
-          <w:rFonts w:hint="cs"/>
-          <w:rtl/>
-        </w:rPr>
-        <w:t xml:space="preserve"> ، دو سطح باشد و شامل تفضیلی 1 و تفضیلی 2 بشود و یا </w:t>
-      </w:r>
-      <w:r>
-        <w:rPr>
-          <w:rFonts w:hint="cs"/>
-          <w:rtl/>
-        </w:rPr>
-        <w:t>تعداد سطوح تفضیلی</w:t>
-      </w:r>
-      <w:r>
-        <w:rPr>
-          <w:rFonts w:hint="cs"/>
-          <w:rtl/>
-        </w:rPr>
-        <w:t xml:space="preserve"> سه سطح باشد و شامل </w:t>
-      </w:r>
-      <w:r>
-        <w:rPr>
-          <w:rFonts w:hint="cs"/>
-          <w:rtl/>
-        </w:rPr>
-        <w:t>تفضیلی 1 و تفضیلی 2</w:t>
-      </w:r>
-      <w:r>
-        <w:rPr>
-          <w:rFonts w:hint="cs"/>
-          <w:rtl/>
-        </w:rPr>
-        <w:t xml:space="preserve"> و تفضیلی 3 بشود </w:t>
-      </w:r>
-    </w:p>
-    <w:p>
-      <w:pPr>
-        <w:bidi/>
-        <w:rPr>
-          <w:rtl/>
-        </w:rPr>
-      </w:pPr>
-      <w:r>
-        <w:rPr>
-          <w:rFonts w:hint="cs"/>
-          <w:rtl/>
-        </w:rPr>
-        <w:t>99999999999999999999999999999</w:t>
-      </w:r>
-    </w:p>
-    <w:p>
-      <w:pPr>
-        <w:bidi/>
-        <w:rPr>
-          <w:rtl/>
-        </w:rPr>
-      </w:pPr>
-      <w:r>
-        <w:rPr>
-          <w:rtl/>
-        </w:rPr>
-        <w:t>در این صفحه تصویر اول</w:t>
-      </w:r>
-    </w:p>
-    <w:p>
-      <w:pPr>
-        <w:bidi/>
-      </w:pPr>
-      <w:r>
-        <w:br/>
-      </w:r>
-      <w:r>
-        <w:rPr>
-          <w:rtl/>
-        </w:rPr>
-        <w:t xml:space="preserve">بهکامبوباکس </w:t>
-      </w:r>
-      <w:r>
-        <w:br/>
-      </w:r>
-      <w:r>
-        <w:rPr>
-          <w:rtl/>
-        </w:rPr>
-        <w:t>نمایش سرفصل تا سطح</w:t>
-      </w:r>
-      <w:r>
-        <w:t>:</w:t>
-      </w:r>
-      <w:r>
-        <w:br/>
-      </w:r>
-      <w:r>
-        <w:rPr>
-          <w:rtl/>
-        </w:rPr>
-        <w:t>می خوام که یک آیتم هم با عنوان "تفضیلی 3" اضافه کنی و می خوام که در موقع ایجاد سطح فرزند ، حداکثر تا سطح تفضیلی 3 اجازه ایجاد کدینگ سرفصل حساب داده بشه و نه بشتر و سطح تفضیلی 3 بعنوان پایین ترین سطح فرزندان در نظر گرفته بشه</w:t>
-      </w:r>
     </w:p>
     <w:sectPr>
       <w:pgSz w:w="12240" w:h="15840"/>

</xml_diff>